<commit_message>
Manuscript v3: use the pilot's official Wang Yun sensitivity numbers
Replaces the manuscript thread's own re-run with the pilot thread's
results (yisheng_models_wangyun_sensitivity.csv): without Wang's nine
rejected labels H1a OR 2.51, H1c OR 2.11 (one-sided p = 0.014, Holm
about 0.04), H2 OR 20.5; recoding them as ordinary compounds gives the
same picture. Adds the H2 row to Table 5 and states that 144 of the 212
labels have not yet been collated with the Xiao Xu.

Co-Authored-By: Claude Opus 5.5 (1M context) <noreply@anthropic.com>
Claude-Session: https://claude.ai/code/session_01DUE6qmVUYLALYANskiA97J
</commit_message>
<xml_diff>
--- a/youwen/manuscript/yisheng_paper_v3.docx
+++ b/youwen/manuscript/yisheng_paper_v3.docx
@@ -3381,7 +3381,7 @@
               <w:pStyle w:val="Compact"/>
             </w:pPr>
             <w:r>
-              <w:t xml:space="preserve">MC identical, Wang Yun’s 9 rejected labels removed ‡</w:t>
+              <w:t xml:space="preserve">MC identical, Wang Yun’s 9 rejected labels removed</w:t>
             </w:r>
           </w:p>
         </w:tc>
@@ -3403,18 +3403,18 @@
               <w:pStyle w:val="Compact"/>
             </w:pPr>
             <w:r>
-              <w:t xml:space="preserve">133/858 (15.5%)</w:t>
-            </w:r>
-          </w:p>
-        </w:tc>
-        <w:tc>
-          <w:tcPr/>
-          <w:p>
-            <w:pPr>
-              <w:pStyle w:val="Compact"/>
-            </w:pPr>
-            <w:r>
-              <w:t xml:space="preserve">GEE OR 2.37 [1.68, 3.36]</w:t>
+              <w:t xml:space="preserve">121/818 (14.8%)</w:t>
+            </w:r>
+          </w:p>
+        </w:tc>
+        <w:tc>
+          <w:tcPr/>
+          <w:p>
+            <w:pPr>
+              <w:pStyle w:val="Compact"/>
+            </w:pPr>
+            <w:r>
+              <w:t xml:space="preserve">GEE OR 2.51 [1.76, 3.57]; one-sided p = 1.8 × 10⁻⁷</w:t>
             </w:r>
           </w:p>
         </w:tc>
@@ -3481,7 +3481,7 @@
         <w:t xml:space="preserve"> </w:t>
       </w:r>
       <w:r>
-        <w:t xml:space="preserve">Fisher tests are one-sided. The random-intercept model gives OR 2.77 [1.96, 3.93] for the first row. ‡ Our re-run, to be confirmed against the project’s model scripts; removing </w:t>
+        <w:t xml:space="preserve">Fisher tests are one-sided. The random-intercept model gives OR 2.77 [1.96, 3.93] for the first row. Removing Wang’s nine labels also removes the phonetics left without a labelled member, hence the smaller ordinary group; removing </w:t>
       </w:r>
       <w:r>
         <w:rPr>
@@ -3490,7 +3490,7 @@
         <w:t xml:space="preserve">媄</w:t>
       </w:r>
       <w:r>
-        <w:t xml:space="preserve"> as well gives OR 2.34 [1.65, 3.32].</w:t>
+        <w:t xml:space="preserve"> as well, or recoding the nine as ordinary compounds instead of removing them, gives OR 2.47 and 2.49.</w:t>
       </w:r>
     </w:p>
     <w:bookmarkEnd w:id="20"/>
@@ -4481,7 +4481,7 @@
               <w:pStyle w:val="Compact"/>
             </w:pPr>
             <w:r>
-              <w:t xml:space="preserve">Member departing, Wang Yun’s 9 rejected labels removed ‡</w:t>
+              <w:t xml:space="preserve">Member departing, Wang Yun’s 9 rejected labels removed</w:t>
             </w:r>
           </w:p>
         </w:tc>
@@ -4503,18 +4503,18 @@
               <w:pStyle w:val="Compact"/>
             </w:pPr>
             <w:r>
-              <w:t xml:space="preserve">43/150 (28.7%)</w:t>
-            </w:r>
-          </w:p>
-        </w:tc>
-        <w:tc>
-          <w:tcPr/>
-          <w:p>
-            <w:pPr>
-              <w:pStyle w:val="Compact"/>
-            </w:pPr>
-            <w:r>
-              <w:t xml:space="preserve">GEE OR 2.21 [1.14, 4.29], one-sided p = 0.010; Fisher p = 0.069</w:t>
+              <w:t xml:space="preserve">43/140 (30.7%)</w:t>
+            </w:r>
+          </w:p>
+        </w:tc>
+        <w:tc>
+          <w:tcPr/>
+          <w:p>
+            <w:pPr>
+              <w:pStyle w:val="Compact"/>
+            </w:pPr>
+            <w:r>
+              <w:t xml:space="preserve">GEE OR 2.11 [1.08, 4.11]; one-sided p = 0.014 (Holm ≈ 0.04)</w:t>
             </w:r>
           </w:p>
         </w:tc>
@@ -4535,7 +4535,7 @@
         <w:t xml:space="preserve"> </w:t>
       </w:r>
       <w:r>
-        <w:t xml:space="preserve">‡ Our re-run, to be confirmed against the project’s model scripts; removing </w:t>
+        <w:t xml:space="preserve">Removing </w:t>
       </w:r>
       <w:r>
         <w:rPr>
@@ -4559,7 +4559,10 @@
         <w:rPr>
           <w:rFonts w:hint="eastAsia"/>
         </w:rPr>
-        <w:t xml:space="preserve">美.</w:t>
+        <w:t xml:space="preserve">美;</w:t>
+      </w:r>
+      <w:r>
+        <w:t xml:space="preserve"> recoding the nine as ordinary compounds gives OR 2.04 [1.04, 3.98], one-sided p = 0.019.</w:t>
       </w:r>
     </w:p>
     <w:bookmarkEnd w:id="22"/>
@@ -4878,6 +4881,52 @@
           </w:p>
         </w:tc>
       </w:tr>
+      <w:tr>
+        <w:tc>
+          <w:tcPr/>
+          <w:p>
+            <w:pPr>
+              <w:pStyle w:val="Compact"/>
+            </w:pPr>
+            <w:r>
+              <w:t xml:space="preserve">Related, Wang Yun’s 9 rejected labels removed</w:t>
+            </w:r>
+          </w:p>
+        </w:tc>
+        <w:tc>
+          <w:tcPr/>
+          <w:p>
+            <w:pPr>
+              <w:pStyle w:val="Compact"/>
+            </w:pPr>
+            <w:r>
+              <w:t xml:space="preserve">23/31 (74.2%)</w:t>
+            </w:r>
+          </w:p>
+        </w:tc>
+        <w:tc>
+          <w:tcPr/>
+          <w:p>
+            <w:pPr>
+              <w:pStyle w:val="Compact"/>
+            </w:pPr>
+            <w:r>
+              <w:t xml:space="preserve">6/50 (12.0%)</w:t>
+            </w:r>
+          </w:p>
+        </w:tc>
+        <w:tc>
+          <w:tcPr/>
+          <w:p>
+            <w:pPr>
+              <w:pStyle w:val="Compact"/>
+            </w:pPr>
+            <w:r>
+              <w:t xml:space="preserve">GEE OR 20.5 [6.6, 63.9]</w:t>
+            </w:r>
+          </w:p>
+        </w:tc>
+      </w:tr>
     </w:tbl>
     <w:p>
       <w:pPr>
@@ -4984,7 +5033,7 @@
         <w:t xml:space="preserve">(貧</w:t>
       </w:r>
       <w:r>
-        <w:t xml:space="preserve"> among them) lack the label, and because the aligned entries are far less often homophonous than the rest (12 of 57 against 51 of 120), they cannot support an inference either way. Wang Yun’s verdicts supply a partial check where the alignment fails, and removing the nine labels he rejects leaves H1a intact and H1c weaker but standing (Tables 2 and 4; see Section 5.2).</w:t>
+        <w:t xml:space="preserve"> among them) lack the label; the other 144 have not yet been collated. Because the aligned entries are far less often homophonous than the rest (12 of 57 against 51 of 120), they cannot support an inference either way. Wang Yun’s verdicts supply a partial check where the alignment fails, and removing the nine labels he rejects leaves H1a and H2 intact and H1c weaker but standing (Tables 2, 4 and 5; see Section 5.2).</w:t>
       </w:r>
     </w:p>
     <w:p>
@@ -5580,7 +5629,7 @@
         <w:t xml:space="preserve">坪</w:t>
       </w:r>
       <w:r>
-        <w:t xml:space="preserve"> are the departing-tone members of their pairs. Yet removing all nine leaves H1a untouched and weakens H1c without removing it: the clustered odds ratio falls from 2.44 to 2.21 and stays significant (one-sided p = 0.010), although the unclustered Fisher test no longer is (p = 0.07; Tables 2 and 4). His verdicts do not separate the sound relations either, for three of the four labels he accepts </w:t>
+        <w:t xml:space="preserve"> are the departing-tone members of their pairs. Yet removing all nine leaves H1a and H2 much as they were (OR 2.51 and 20.5) and weakens only H1c, whose odds ratio falls from 2.44 to 2.11 (one-sided p = 0.014, about 0.04 after Holm correction, so with little to spare); recoding the nine as ordinary compounds instead of removing them gives the same picture (Tables 2, 4 and 5). His verdicts do not separate the sound relations either, for three of the four labels he accepts </w:t>
       </w:r>
       <w:r>
         <w:rPr>
@@ -5615,7 +5664,7 @@
         <w:pStyle w:val="BodyText"/>
       </w:pPr>
       <w:r>
-        <w:t xml:space="preserve">Attribution is what remains open. Wang examined thirteen labels, and the Xiǎo Xú could be aligned for only 68 (Section 4.5); his remarks report seven on which it lacks the label </w:t>
+        <w:t xml:space="preserve">Attribution is what remains open. Wang examined thirteen labels, and the Xiǎo Xú has so far been compared for only 68 of the 212, the other 144 not yet collated (Section 4.5); his remarks report seven on which it lacks the label </w:t>
       </w:r>
       <w:r>
         <w:rPr>
@@ -5896,7 +5945,7 @@
         <w:t xml:space="preserve">xīnfù</w:t>
       </w:r>
       <w:r>
-        <w:t xml:space="preserve">, and every cited form must be checked in print, above all against the 1963 Zhonghua facsimile of the Dà Xú. The Xiǎo Xú e-text, moreover, is too incomplete to test H3, and until that recension is collated in facsimile, the share of the labels that goes back to Xu Shen rather than to his editors cannot be fixed (Section 5.2). And because the hypotheses were refined after an exploratory look, every test is reported, the null for H1b and the unplanned decomposition of H1c included.</w:t>
+        <w:t xml:space="preserve">, and every cited form must be checked in print, above all against the 1963 Zhonghua facsimile of the Dà Xú. The Xiǎo Xú, moreover, has been compared for only 68 of the 212 labels, too few to test H3, and until the other 144 are collated in facsimile, the share of the labels that goes back to Xu Shen rather than to his editors cannot be fixed (Section 5.2). And because the hypotheses were refined after an exploratory look, every test is reported, the null for H1b and the unplanned decomposition of H1c included.</w:t>
       </w:r>
     </w:p>
     <w:bookmarkEnd w:id="32"/>

</xml_diff>